<commit_message>
Added new files of study material
</commit_message>
<xml_diff>
--- a/study-material/Playwright Filechooser.docx
+++ b/study-material/Playwright Filechooser.docx
@@ -5,6 +5,354 @@
     <w:p>
       <w:r>
         <w:t>To upload file into the dialog box</w:t>
+      </w:r>
+    </w:p>
+    <w:p>
+      <w:pPr>
+        <w:shd w:val="clear" w:color="auto" w:fill="F6F8FA"/>
+        <w:spacing w:after="0" w:line="240" w:lineRule="auto"/>
+        <w:rPr>
+          <w:rFonts w:ascii="Consolas" w:eastAsia="Times New Roman" w:hAnsi="Consolas" w:cs="Times New Roman"/>
+          <w:color w:val="2E2E2C"/>
+          <w:sz w:val="23"/>
+          <w:szCs w:val="23"/>
+        </w:rPr>
+      </w:pPr>
+      <w:proofErr w:type="spellStart"/>
+      <w:r>
+        <w:rPr>
+          <w:rFonts w:ascii="Consolas" w:eastAsia="Times New Roman" w:hAnsi="Consolas" w:cs="Times New Roman"/>
+          <w:color w:val="116329"/>
+          <w:sz w:val="23"/>
+          <w:szCs w:val="23"/>
+        </w:rPr>
+        <w:t>FileChooser</w:t>
+      </w:r>
+      <w:proofErr w:type="spellEnd"/>
+      <w:r>
+        <w:rPr>
+          <w:rFonts w:ascii="Consolas" w:eastAsia="Times New Roman" w:hAnsi="Consolas" w:cs="Times New Roman"/>
+          <w:color w:val="2E2E2C"/>
+          <w:sz w:val="23"/>
+          <w:szCs w:val="23"/>
+        </w:rPr>
+        <w:t xml:space="preserve"> </w:t>
+      </w:r>
+      <w:proofErr w:type="spellStart"/>
+      <w:r>
+        <w:rPr>
+          <w:rFonts w:ascii="Consolas" w:eastAsia="Times New Roman" w:hAnsi="Consolas" w:cs="Times New Roman"/>
+          <w:color w:val="2E2E2C"/>
+          <w:sz w:val="23"/>
+          <w:szCs w:val="23"/>
+        </w:rPr>
+        <w:t>fileChooser</w:t>
+      </w:r>
+      <w:proofErr w:type="spellEnd"/>
+      <w:r>
+        <w:rPr>
+          <w:rFonts w:ascii="Consolas" w:eastAsia="Times New Roman" w:hAnsi="Consolas" w:cs="Times New Roman"/>
+          <w:color w:val="2E2E2C"/>
+          <w:sz w:val="23"/>
+          <w:szCs w:val="23"/>
+        </w:rPr>
+        <w:t xml:space="preserve"> </w:t>
+      </w:r>
+      <w:r>
+        <w:rPr>
+          <w:rFonts w:ascii="Consolas" w:eastAsia="Times New Roman" w:hAnsi="Consolas" w:cs="Times New Roman"/>
+          <w:color w:val="D73A49"/>
+          <w:sz w:val="23"/>
+          <w:szCs w:val="23"/>
+        </w:rPr>
+        <w:t>=</w:t>
+      </w:r>
+      <w:r>
+        <w:rPr>
+          <w:rFonts w:ascii="Consolas" w:eastAsia="Times New Roman" w:hAnsi="Consolas" w:cs="Times New Roman"/>
+          <w:color w:val="2E2E2C"/>
+          <w:sz w:val="23"/>
+          <w:szCs w:val="23"/>
+        </w:rPr>
+        <w:t xml:space="preserve"> </w:t>
+      </w:r>
+      <w:proofErr w:type="spellStart"/>
+      <w:proofErr w:type="gramStart"/>
+      <w:r>
+        <w:rPr>
+          <w:rFonts w:ascii="Consolas" w:eastAsia="Times New Roman" w:hAnsi="Consolas" w:cs="Times New Roman"/>
+          <w:color w:val="2E2E2C"/>
+          <w:sz w:val="23"/>
+          <w:szCs w:val="23"/>
+        </w:rPr>
+        <w:t>page</w:t>
+      </w:r>
+      <w:r>
+        <w:rPr>
+          <w:rFonts w:ascii="Consolas" w:eastAsia="Times New Roman" w:hAnsi="Consolas" w:cs="Times New Roman"/>
+          <w:color w:val="393A34"/>
+          <w:sz w:val="23"/>
+          <w:szCs w:val="23"/>
+        </w:rPr>
+        <w:t>.</w:t>
+      </w:r>
+      <w:r>
+        <w:rPr>
+          <w:rFonts w:ascii="Consolas" w:eastAsia="Times New Roman" w:hAnsi="Consolas" w:cs="Times New Roman"/>
+          <w:color w:val="8250DF"/>
+          <w:sz w:val="23"/>
+          <w:szCs w:val="23"/>
+        </w:rPr>
+        <w:t>waitForFileChooser</w:t>
+      </w:r>
+      <w:proofErr w:type="spellEnd"/>
+      <w:r>
+        <w:rPr>
+          <w:rFonts w:ascii="Consolas" w:eastAsia="Times New Roman" w:hAnsi="Consolas" w:cs="Times New Roman"/>
+          <w:color w:val="393A34"/>
+          <w:sz w:val="23"/>
+          <w:szCs w:val="23"/>
+        </w:rPr>
+        <w:t>(</w:t>
+      </w:r>
+      <w:proofErr w:type="gramEnd"/>
+      <w:r>
+        <w:rPr>
+          <w:rFonts w:ascii="Consolas" w:eastAsia="Times New Roman" w:hAnsi="Consolas" w:cs="Times New Roman"/>
+          <w:color w:val="393A34"/>
+          <w:sz w:val="23"/>
+          <w:szCs w:val="23"/>
+        </w:rPr>
+        <w:t>()</w:t>
+      </w:r>
+      <w:r>
+        <w:rPr>
+          <w:rFonts w:ascii="Consolas" w:eastAsia="Times New Roman" w:hAnsi="Consolas" w:cs="Times New Roman"/>
+          <w:color w:val="2E2E2C"/>
+          <w:sz w:val="23"/>
+          <w:szCs w:val="23"/>
+        </w:rPr>
+        <w:t xml:space="preserve"> </w:t>
+      </w:r>
+      <w:r>
+        <w:rPr>
+          <w:rFonts w:ascii="Consolas" w:eastAsia="Times New Roman" w:hAnsi="Consolas" w:cs="Times New Roman"/>
+          <w:color w:val="D73A49"/>
+          <w:sz w:val="23"/>
+          <w:szCs w:val="23"/>
+        </w:rPr>
+        <w:t>-&gt;</w:t>
+      </w:r>
+      <w:r>
+        <w:rPr>
+          <w:rFonts w:ascii="Consolas" w:eastAsia="Times New Roman" w:hAnsi="Consolas" w:cs="Times New Roman"/>
+          <w:color w:val="2E2E2C"/>
+          <w:sz w:val="23"/>
+          <w:szCs w:val="23"/>
+        </w:rPr>
+        <w:t xml:space="preserve"> </w:t>
+      </w:r>
+      <w:proofErr w:type="spellStart"/>
+      <w:r>
+        <w:rPr>
+          <w:rFonts w:ascii="Consolas" w:eastAsia="Times New Roman" w:hAnsi="Consolas" w:cs="Times New Roman"/>
+          <w:color w:val="2E2E2C"/>
+          <w:sz w:val="23"/>
+          <w:szCs w:val="23"/>
+        </w:rPr>
+        <w:t>page</w:t>
+      </w:r>
+      <w:r>
+        <w:rPr>
+          <w:rFonts w:ascii="Consolas" w:eastAsia="Times New Roman" w:hAnsi="Consolas" w:cs="Times New Roman"/>
+          <w:color w:val="393A34"/>
+          <w:sz w:val="23"/>
+          <w:szCs w:val="23"/>
+        </w:rPr>
+        <w:t>.</w:t>
+      </w:r>
+      <w:r>
+        <w:rPr>
+          <w:rFonts w:ascii="Consolas" w:eastAsia="Times New Roman" w:hAnsi="Consolas" w:cs="Times New Roman"/>
+          <w:color w:val="8250DF"/>
+          <w:sz w:val="23"/>
+          <w:szCs w:val="23"/>
+        </w:rPr>
+        <w:t>getByText</w:t>
+      </w:r>
+      <w:proofErr w:type="spellEnd"/>
+      <w:r>
+        <w:rPr>
+          <w:rFonts w:ascii="Consolas" w:eastAsia="Times New Roman" w:hAnsi="Consolas" w:cs="Times New Roman"/>
+          <w:color w:val="393A34"/>
+          <w:sz w:val="23"/>
+          <w:szCs w:val="23"/>
+        </w:rPr>
+        <w:t>(</w:t>
+      </w:r>
+      <w:r>
+        <w:rPr>
+          <w:rFonts w:ascii="Consolas" w:eastAsia="Times New Roman" w:hAnsi="Consolas" w:cs="Times New Roman"/>
+          <w:color w:val="C6105F"/>
+          <w:sz w:val="23"/>
+          <w:szCs w:val="23"/>
+        </w:rPr>
+        <w:t>"Upload file"</w:t>
+      </w:r>
+      <w:r>
+        <w:rPr>
+          <w:rFonts w:ascii="Consolas" w:eastAsia="Times New Roman" w:hAnsi="Consolas" w:cs="Times New Roman"/>
+          <w:color w:val="393A34"/>
+          <w:sz w:val="23"/>
+          <w:szCs w:val="23"/>
+        </w:rPr>
+        <w:t>).</w:t>
+      </w:r>
+      <w:r>
+        <w:rPr>
+          <w:rFonts w:ascii="Consolas" w:eastAsia="Times New Roman" w:hAnsi="Consolas" w:cs="Times New Roman"/>
+          <w:color w:val="8250DF"/>
+          <w:sz w:val="23"/>
+          <w:szCs w:val="23"/>
+        </w:rPr>
+        <w:t>click</w:t>
+      </w:r>
+      <w:r>
+        <w:rPr>
+          <w:rFonts w:ascii="Consolas" w:eastAsia="Times New Roman" w:hAnsi="Consolas" w:cs="Times New Roman"/>
+          <w:color w:val="393A34"/>
+          <w:sz w:val="23"/>
+          <w:szCs w:val="23"/>
+        </w:rPr>
+        <w:t>());</w:t>
+      </w:r>
+    </w:p>
+    <w:p>
+      <w:pPr>
+        <w:shd w:val="clear" w:color="auto" w:fill="F6F8FA"/>
+        <w:spacing w:after="0" w:line="240" w:lineRule="auto"/>
+        <w:rPr>
+          <w:rFonts w:ascii="Consolas" w:eastAsia="Times New Roman" w:hAnsi="Consolas" w:cs="Times New Roman"/>
+          <w:color w:val="2E2E2C"/>
+          <w:sz w:val="23"/>
+          <w:szCs w:val="23"/>
+        </w:rPr>
+      </w:pPr>
+      <w:proofErr w:type="spellStart"/>
+      <w:proofErr w:type="gramStart"/>
+      <w:r>
+        <w:rPr>
+          <w:rFonts w:ascii="Consolas" w:eastAsia="Times New Roman" w:hAnsi="Consolas" w:cs="Times New Roman"/>
+          <w:color w:val="2E2E2C"/>
+          <w:sz w:val="23"/>
+          <w:szCs w:val="23"/>
+        </w:rPr>
+        <w:t>fileChooser</w:t>
+      </w:r>
+      <w:r>
+        <w:rPr>
+          <w:rFonts w:ascii="Consolas" w:eastAsia="Times New Roman" w:hAnsi="Consolas" w:cs="Times New Roman"/>
+          <w:color w:val="393A34"/>
+          <w:sz w:val="23"/>
+          <w:szCs w:val="23"/>
+        </w:rPr>
+        <w:t>.</w:t>
+      </w:r>
+      <w:r>
+        <w:rPr>
+          <w:rFonts w:ascii="Consolas" w:eastAsia="Times New Roman" w:hAnsi="Consolas" w:cs="Times New Roman"/>
+          <w:color w:val="8250DF"/>
+          <w:sz w:val="23"/>
+          <w:szCs w:val="23"/>
+        </w:rPr>
+        <w:t>setFiles</w:t>
+      </w:r>
+      <w:proofErr w:type="spellEnd"/>
+      <w:r>
+        <w:rPr>
+          <w:rFonts w:ascii="Consolas" w:eastAsia="Times New Roman" w:hAnsi="Consolas" w:cs="Times New Roman"/>
+          <w:color w:val="393A34"/>
+          <w:sz w:val="23"/>
+          <w:szCs w:val="23"/>
+        </w:rPr>
+        <w:t>(</w:t>
+      </w:r>
+      <w:proofErr w:type="spellStart"/>
+      <w:proofErr w:type="gramEnd"/>
+      <w:r>
+        <w:rPr>
+          <w:rFonts w:ascii="Consolas" w:eastAsia="Times New Roman" w:hAnsi="Consolas" w:cs="Times New Roman"/>
+          <w:color w:val="116329"/>
+          <w:sz w:val="23"/>
+          <w:szCs w:val="23"/>
+        </w:rPr>
+        <w:t>Paths</w:t>
+      </w:r>
+      <w:r>
+        <w:rPr>
+          <w:rFonts w:ascii="Consolas" w:eastAsia="Times New Roman" w:hAnsi="Consolas" w:cs="Times New Roman"/>
+          <w:color w:val="393A34"/>
+          <w:sz w:val="23"/>
+          <w:szCs w:val="23"/>
+        </w:rPr>
+        <w:t>.</w:t>
+      </w:r>
+      <w:r>
+        <w:rPr>
+          <w:rFonts w:ascii="Consolas" w:eastAsia="Times New Roman" w:hAnsi="Consolas" w:cs="Times New Roman"/>
+          <w:color w:val="8250DF"/>
+          <w:sz w:val="23"/>
+          <w:szCs w:val="23"/>
+        </w:rPr>
+        <w:t>get</w:t>
+      </w:r>
+      <w:proofErr w:type="spellEnd"/>
+      <w:r>
+        <w:rPr>
+          <w:rFonts w:ascii="Consolas" w:eastAsia="Times New Roman" w:hAnsi="Consolas" w:cs="Times New Roman"/>
+          <w:color w:val="393A34"/>
+          <w:sz w:val="23"/>
+          <w:szCs w:val="23"/>
+        </w:rPr>
+        <w:t>(</w:t>
+      </w:r>
+      <w:r>
+        <w:rPr>
+          <w:rFonts w:ascii="Consolas" w:eastAsia="Times New Roman" w:hAnsi="Consolas" w:cs="Times New Roman"/>
+          <w:color w:val="C6105F"/>
+          <w:sz w:val="23"/>
+          <w:szCs w:val="23"/>
+        </w:rPr>
+        <w:t>"</w:t>
+      </w:r>
+      <w:proofErr w:type="spellStart"/>
+      <w:r>
+        <w:rPr>
+          <w:rFonts w:ascii="Consolas" w:eastAsia="Times New Roman" w:hAnsi="Consolas" w:cs="Times New Roman"/>
+          <w:color w:val="C6105F"/>
+          <w:sz w:val="23"/>
+          <w:szCs w:val="23"/>
+        </w:rPr>
+        <w:t>myfile.pdf</w:t>
+      </w:r>
+      <w:proofErr w:type="spellEnd"/>
+      <w:r>
+        <w:rPr>
+          <w:rFonts w:ascii="Consolas" w:eastAsia="Times New Roman" w:hAnsi="Consolas" w:cs="Times New Roman"/>
+          <w:color w:val="C6105F"/>
+          <w:sz w:val="23"/>
+          <w:szCs w:val="23"/>
+        </w:rPr>
+        <w:t>"</w:t>
+      </w:r>
+      <w:r>
+        <w:rPr>
+          <w:rFonts w:ascii="Consolas" w:eastAsia="Times New Roman" w:hAnsi="Consolas" w:cs="Times New Roman"/>
+          <w:color w:val="393A34"/>
+          <w:sz w:val="23"/>
+          <w:szCs w:val="23"/>
+        </w:rPr>
+        <w:t>));</w:t>
       </w:r>
     </w:p>
     <w:p>
@@ -582,6 +930,11 @@
       <w:rFonts w:cs="Mangal"/>
     </w:rPr>
   </w:style>
+  <w:style w:type="character" w:customStyle="1" w:styleId="token">
+    <w:name w:val="token"/>
+    <w:basedOn w:val="DefaultParagraphFont"/>
+    <w:rsid w:val="001F63D7"/>
+  </w:style>
 </w:styles>
 </file>
 

</xml_diff>